<commit_message>
Add trilingual (IT/DE/EN) DOCX permit templates
- Rewrite create_permit_template command with full IT/German/English text
- Italian text displayed normally (black, bold where appropriate)
- German and English shown in smaller grey font below each Italian line
- Trilingual field labels: "Nome / Vorname / First name: ..."
- Both admin (cedolino) and client (parabrezza) templates updated
- Regenerate both .docx files; all {{ placeholders }} verified intact

Co-Authored-By: Claude Sonnet 4.6 <noreply@anthropic.com>
</commit_message>
<xml_diff>
--- a/docx_templates/permit_template_admin.docx
+++ b/docx_templates/permit_template_admin.docx
@@ -45,10 +45,62 @@
       </w:pPr>
       <w:r>
         <w:rPr>
+          <w:b w:val="0"/>
+          <w:color w:val="646464"/>
+          <w:sz w:val="24"/>
+        </w:rPr>
+        <w:t>MATRIX DER DURCHFAHRTSGENEHMIGUNG</w:t>
+      </w:r>
+    </w:p>
+    <w:p>
+      <w:pPr>
+        <w:jc w:val="center"/>
+      </w:pPr>
+      <w:r>
+        <w:rPr>
+          <w:b w:val="0"/>
+          <w:color w:val="828282"/>
+          <w:sz w:val="24"/>
+        </w:rPr>
+        <w:t>TRANSIT AUTHORIZATION MATRIX</w:t>
+      </w:r>
+    </w:p>
+    <w:p>
+      <w:pPr>
+        <w:jc w:val="center"/>
+      </w:pPr>
+      <w:r>
+        <w:rPr>
           <w:b/>
-          <w:sz w:val="26"/>
+          <w:sz w:val="24"/>
         </w:rPr>
         <w:t>SU STRADA FORESTALE DI TIPO B</w:t>
+      </w:r>
+    </w:p>
+    <w:p>
+      <w:pPr>
+        <w:jc w:val="center"/>
+      </w:pPr>
+      <w:r>
+        <w:rPr>
+          <w:b w:val="0"/>
+          <w:color w:val="646464"/>
+          <w:sz w:val="22"/>
+        </w:rPr>
+        <w:t>AUF FORSTSTRASSE TYP B</w:t>
+      </w:r>
+    </w:p>
+    <w:p>
+      <w:pPr>
+        <w:jc w:val="center"/>
+      </w:pPr>
+      <w:r>
+        <w:rPr>
+          <w:b w:val="0"/>
+          <w:color w:val="828282"/>
+          <w:sz w:val="22"/>
+        </w:rPr>
+        <w:t>ON FOREST ROAD TYPE B</w:t>
       </w:r>
     </w:p>
     <w:p>
@@ -66,10 +118,36 @@
       </w:pPr>
       <w:r>
         <w:rPr>
-          <w:b w:val="0"/>
+          <w:b/>
           <w:sz w:val="22"/>
         </w:rPr>
         <w:t>Il proprietario/gestore della Strada Forestale di Tipo B denominata</w:t>
+      </w:r>
+    </w:p>
+    <w:p>
+      <w:pPr>
+        <w:jc w:val="left"/>
+      </w:pPr>
+      <w:r>
+        <w:rPr>
+          <w:b w:val="0"/>
+          <w:color w:val="646464"/>
+          <w:sz w:val="20"/>
+        </w:rPr>
+        <w:t>Der Eigentümer/Verwalter der Forststraße Typ B namens</w:t>
+      </w:r>
+    </w:p>
+    <w:p>
+      <w:pPr>
+        <w:jc w:val="left"/>
+      </w:pPr>
+      <w:r>
+        <w:rPr>
+          <w:b w:val="0"/>
+          <w:color w:val="828282"/>
+          <w:sz w:val="20"/>
+        </w:rPr>
+        <w:t>The owner/manager of the Type B Forest Road named</w:t>
       </w:r>
     </w:p>
     <w:p>
@@ -79,7 +157,7 @@
       <w:r>
         <w:rPr>
           <w:b/>
-          <w:sz w:val="26"/>
+          <w:sz w:val="28"/>
         </w:rPr>
         <w:t>MALGA CAMPO</w:t>
       </w:r>
@@ -90,19 +168,46 @@
       </w:pPr>
       <w:r>
         <w:rPr>
-          <w:b w:val="0"/>
+          <w:b/>
           <w:sz w:val="22"/>
         </w:rPr>
         <w:t>rilascia al Signor/a:</w:t>
+      </w:r>
+    </w:p>
+    <w:p>
+      <w:pPr>
+        <w:jc w:val="left"/>
+      </w:pPr>
+      <w:r>
+        <w:rPr>
+          <w:b w:val="0"/>
+          <w:color w:val="646464"/>
+          <w:sz w:val="20"/>
+        </w:rPr>
+        <w:t>gewährt Herrn/Frau:</w:t>
+      </w:r>
+    </w:p>
+    <w:p>
+      <w:pPr>
+        <w:jc w:val="left"/>
+      </w:pPr>
+      <w:r>
+        <w:rPr>
+          <w:b w:val="0"/>
+          <w:color w:val="828282"/>
+          <w:sz w:val="20"/>
+        </w:rPr>
+        <w:t>grants to Mr./Ms.:</w:t>
       </w:r>
     </w:p>
     <w:p/>
     <w:p>
       <w:r>
         <w:rPr>
-          <w:sz w:val="22"/>
+          <w:color w:val="505050"/>
+          <w:sz w:val="20"/>
         </w:rPr>
-        <w:t xml:space="preserve">Nome:  </w:t>
+        <w:t xml:space="preserve">Nome / Vorname / First name:  </w:t>
       </w:r>
       <w:r>
         <w:rPr>
@@ -115,9 +220,10 @@
     <w:p>
       <w:r>
         <w:rPr>
-          <w:sz w:val="22"/>
+          <w:color w:val="505050"/>
+          <w:sz w:val="20"/>
         </w:rPr>
-        <w:t xml:space="preserve">Cognome:  </w:t>
+        <w:t xml:space="preserve">Cognome / Nachname / Last name:  </w:t>
       </w:r>
       <w:r>
         <w:rPr>
@@ -130,9 +236,10 @@
     <w:p>
       <w:r>
         <w:rPr>
-          <w:sz w:val="22"/>
+          <w:color w:val="505050"/>
+          <w:sz w:val="20"/>
         </w:rPr>
-        <w:t xml:space="preserve">Residente a:  </w:t>
+        <w:t xml:space="preserve">Residente a / Wohnhaft in / Resident in:  </w:t>
       </w:r>
       <w:r>
         <w:rPr>
@@ -149,7 +256,7 @@
       </w:pPr>
       <w:r>
         <w:rPr>
-          <w:b w:val="0"/>
+          <w:b/>
           <w:sz w:val="22"/>
         </w:rPr>
         <w:t>il quale ha dichiarato di dover percorrere la strada forestale sopra citata</w:t>
@@ -158,11 +265,43 @@
       </w:r>
     </w:p>
     <w:p>
+      <w:pPr>
+        <w:jc w:val="left"/>
+      </w:pPr>
       <w:r>
         <w:rPr>
-          <w:sz w:val="22"/>
+          <w:b w:val="0"/>
+          <w:color w:val="646464"/>
+          <w:sz w:val="20"/>
         </w:rPr>
-        <w:t xml:space="preserve">Tipo veicolo:  </w:t>
+        <w:t>der/die erklärt hat, die oben genannte Forststraße</w:t>
+        <w:br/>
+        <w:t>mit folgendem Fahrzeug befahren zu müssen:</w:t>
+      </w:r>
+    </w:p>
+    <w:p>
+      <w:pPr>
+        <w:jc w:val="left"/>
+      </w:pPr>
+      <w:r>
+        <w:rPr>
+          <w:b w:val="0"/>
+          <w:color w:val="828282"/>
+          <w:sz w:val="20"/>
+        </w:rPr>
+        <w:t>who has declared the need to travel on the aforementioned forest road</w:t>
+        <w:br/>
+        <w:t>with the following vehicle:</w:t>
+      </w:r>
+    </w:p>
+    <w:p/>
+    <w:p>
+      <w:r>
+        <w:rPr>
+          <w:color w:val="505050"/>
+          <w:sz w:val="20"/>
+        </w:rPr>
+        <w:t xml:space="preserve">Tipo veicolo / Fahrzeugtyp / Vehicle type:  </w:t>
       </w:r>
       <w:r>
         <w:rPr>
@@ -175,9 +314,10 @@
     <w:p>
       <w:r>
         <w:rPr>
-          <w:sz w:val="22"/>
+          <w:color w:val="505050"/>
+          <w:sz w:val="20"/>
         </w:rPr>
-        <w:t xml:space="preserve">Targa:  </w:t>
+        <w:t xml:space="preserve">Targa / Kennzeichen / Plate:  </w:t>
       </w:r>
       <w:r>
         <w:rPr>
@@ -190,22 +330,49 @@
     <w:p/>
     <w:p>
       <w:pPr>
-        <w:jc w:val="left"/>
+        <w:jc w:val="center"/>
       </w:pPr>
       <w:r>
         <w:rPr>
           <w:b/>
-          <w:sz w:val="22"/>
+          <w:sz w:val="24"/>
         </w:rPr>
         <w:t>L'AUTORIZZAZIONE AL TRANSITO PER IL PERIODO</w:t>
       </w:r>
     </w:p>
     <w:p>
+      <w:pPr>
+        <w:jc w:val="center"/>
+      </w:pPr>
       <w:r>
         <w:rPr>
+          <w:b w:val="0"/>
+          <w:color w:val="646464"/>
           <w:sz w:val="22"/>
         </w:rPr>
-        <w:t xml:space="preserve">dal  </w:t>
+        <w:t>DIE DURCHFAHRTSGENEHMIGUNG FÜR DEN ZEITRAUM</w:t>
+      </w:r>
+    </w:p>
+    <w:p>
+      <w:pPr>
+        <w:jc w:val="center"/>
+      </w:pPr>
+      <w:r>
+        <w:rPr>
+          <w:b w:val="0"/>
+          <w:color w:val="828282"/>
+          <w:sz w:val="22"/>
+        </w:rPr>
+        <w:t>THE TRANSIT AUTHORIZATION FOR THE PERIOD</w:t>
+      </w:r>
+    </w:p>
+    <w:p>
+      <w:r>
+        <w:rPr>
+          <w:color w:val="505050"/>
+          <w:sz w:val="20"/>
+        </w:rPr>
+        <w:t xml:space="preserve">dal / von / from  </w:t>
       </w:r>
       <w:r>
         <w:rPr>
@@ -215,10 +382,14 @@
         <w:t>{{ dal }}</w:t>
       </w:r>
       <w:r>
+        <w:t xml:space="preserve">      </w:t>
+      </w:r>
+      <w:r>
         <w:rPr>
-          <w:sz w:val="22"/>
+          <w:color w:val="505050"/>
+          <w:sz w:val="20"/>
         </w:rPr>
-        <w:t xml:space="preserve">   al   </w:t>
+        <w:t xml:space="preserve">al / bis / to  </w:t>
       </w:r>
       <w:r>
         <w:rPr>
@@ -244,7 +415,7 @@
       <w:r>
         <w:rPr>
           <w:b/>
-          <w:sz w:val="32"/>
+          <w:sz w:val="36"/>
         </w:rPr>
         <w:t>N.  {{ numero }} / {{ anno }}</w:t>
       </w:r>
@@ -261,9 +432,10 @@
     <w:p>
       <w:r>
         <w:rPr>
-          <w:sz w:val="22"/>
+          <w:color w:val="505050"/>
+          <w:sz w:val="20"/>
         </w:rPr>
-        <w:t xml:space="preserve">Data emissione:  </w:t>
+        <w:t xml:space="preserve">Data emissione / Ausstellungsdatum / Issue date:  </w:t>
       </w:r>
       <w:r>
         <w:rPr>
@@ -275,7 +447,7 @@
     </w:p>
     <w:sectPr>
       <w:pgSz w:w="11906" w:h="16838"/>
-      <w:pgMar w:top="1134" w:right="1417" w:bottom="1134" w:left="1417" w:header="720" w:footer="720" w:gutter="0"/>
+      <w:pgMar w:top="1020" w:right="1417" w:bottom="1020" w:left="1417" w:header="720" w:footer="720" w:gutter="0"/>
       <w:cols w:space="720"/>
       <w:docGrid w:linePitch="360"/>
     </w:sectPr>
@@ -647,7 +819,7 @@
     <w:qFormat/>
     <w:rsid w:val="00FC693F"/>
     <w:pPr>
-      <w:spacing w:before="0" w:after="80"/>
+      <w:spacing w:before="0" w:after="60"/>
     </w:pPr>
     <w:rPr>
       <w:rFonts w:ascii="Arial" w:hAnsi="Arial"/>

</xml_diff>

<commit_message>
Compact DOCX templates to fit one page
- Merge DE and EN translations onto a single line (IT / DE / EN)
  instead of three separate paragraphs per block
- Reduce space_after from 3-4pt to 1-2pt globally
- Shrink margins from 1.8cm to 1.5cm top/bottom
- Combine header to one line to save vertical space
- Merge warning notice into single line at Pt(8)
- Result: admin 26 paragraphs (was 40), client 31 (was 46)

Co-Authored-By: Claude Sonnet 4.6 <noreply@anthropic.com>
</commit_message>
<xml_diff>
--- a/docx_templates/permit_template_admin.docx
+++ b/docx_templates/permit_template_admin.docx
@@ -2,6 +2,32 @@
 <file path=word/document.xml><?xml version="1.0" encoding="utf-8"?>
 <w:document xmlns:wpc="http://schemas.microsoft.com/office/word/2010/wordprocessingCanvas" xmlns:mo="http://schemas.microsoft.com/office/mac/office/2008/main" xmlns:mc="http://schemas.openxmlformats.org/markup-compatibility/2006" xmlns:mv="urn:schemas-microsoft-com:mac:vml" xmlns:o="urn:schemas-microsoft-com:office:office" xmlns:r="http://schemas.openxmlformats.org/officeDocument/2006/relationships" xmlns:m="http://schemas.openxmlformats.org/officeDocument/2006/math" xmlns:v="urn:schemas-microsoft-com:vml" xmlns:wp14="http://schemas.microsoft.com/office/word/2010/wordprocessingDrawing" xmlns:wp="http://schemas.openxmlformats.org/drawingml/2006/wordprocessingDrawing" xmlns:w10="urn:schemas-microsoft-com:office:word" xmlns:w="http://schemas.openxmlformats.org/wordprocessingml/2006/main" xmlns:w14="http://schemas.microsoft.com/office/word/2010/wordml" xmlns:wpg="http://schemas.microsoft.com/office/word/2010/wordprocessingGroup" xmlns:wpi="http://schemas.microsoft.com/office/word/2010/wordprocessingInk" xmlns:wne="http://schemas.microsoft.com/office/word/2006/wordml" xmlns:wps="http://schemas.microsoft.com/office/word/2010/wordprocessingShape" mc:Ignorable="w14 wp14">
   <w:body>
+    <w:p>
+      <w:pPr>
+        <w:spacing w:after="60"/>
+        <w:jc w:val="center"/>
+      </w:pPr>
+      <w:r>
+        <w:rPr>
+          <w:b/>
+          <w:sz w:val="18"/>
+        </w:rPr>
+        <w:t>PROVINCIA AUTONOMA DI TRENTO  –  ASUC DI CELENTINO</w:t>
+        <w:br/>
+        <w:t>Via Giovanni Caserotti n. 31 – 38024 Cogolo di Peio (TN)</w:t>
+      </w:r>
+    </w:p>
+    <w:p>
+      <w:pPr>
+        <w:spacing w:after="20"/>
+      </w:pPr>
+      <w:r>
+        <w:rPr>
+          <w:sz w:val="14"/>
+        </w:rPr>
+        <w:t>──────────────────────────────────────────────────────────────</w:t>
+      </w:r>
+    </w:p>
     <w:p>
       <w:pPr>
         <w:jc w:val="center"/>
@@ -9,22 +35,62 @@
       <w:r>
         <w:rPr>
           <w:b/>
+          <w:sz w:val="22"/>
+        </w:rPr>
+        <w:t>MATRICE RELATIVA ALL'AUTORIZZAZIONE AL TRANSITO SU STRADA FORESTALE DI TIPO B</w:t>
+      </w:r>
+    </w:p>
+    <w:p>
+      <w:pPr>
+        <w:spacing w:after="20"/>
+        <w:jc w:val="center"/>
+      </w:pPr>
+      <w:r>
+        <w:rPr>
+          <w:color w:val="464646"/>
+          <w:sz w:val="16"/>
+        </w:rPr>
+        <w:t>MATRIX DER DURCHFAHRTSGENEHMIGUNG AUF FORSTSTRASSE TYP B  /  TRANSIT AUTHORIZATION MATRIX – FOREST ROAD TYPE B</w:t>
+      </w:r>
+    </w:p>
+    <w:p>
+      <w:pPr>
+        <w:spacing w:after="20"/>
+      </w:pPr>
+      <w:r>
+        <w:rPr>
+          <w:sz w:val="14"/>
+        </w:rPr>
+        <w:t>──────────────────────────────────────────────────────────────</w:t>
+      </w:r>
+    </w:p>
+    <w:p>
+      <w:pPr>
+        <w:spacing w:after="60"/>
+      </w:pPr>
+    </w:p>
+    <w:p>
+      <w:pPr>
+        <w:spacing w:after="20"/>
+      </w:pPr>
+      <w:r>
+        <w:rPr>
+          <w:b w:val="0"/>
           <w:sz w:val="20"/>
         </w:rPr>
-        <w:t>PROVINCIA AUTONOMA DI TRENTO</w:t>
-        <w:br/>
-        <w:t>ASUC DI CELENTINO</w:t>
-        <w:br/>
-        <w:t>Via Giovanni Caserotti n. 31 – 38024 Cogolo di Peio (TN)</w:t>
+        <w:t>Il proprietario/gestore della Strada Forestale di Tipo B denominata</w:t>
       </w:r>
     </w:p>
-    <w:p/>
     <w:p>
+      <w:pPr>
+        <w:spacing w:after="40"/>
+      </w:pPr>
       <w:r>
         <w:rPr>
+          <w:color w:val="464646"/>
           <w:sz w:val="16"/>
         </w:rPr>
-        <w:t>────────────────────────────────────────────────────────────</w:t>
+        <w:t>Der Eigentümer/Verwalter der Forststraße Typ B namens  /  The owner/manager of the Type B Forest Road named</w:t>
       </w:r>
     </w:p>
     <w:p>
@@ -36,33 +102,150 @@
           <w:b/>
           <w:sz w:val="26"/>
         </w:rPr>
-        <w:t>MATRICE RELATIVA ALL'AUTORIZZAZIONE AL TRANSITO</w:t>
+        <w:t>MALGA CAMPO</w:t>
       </w:r>
     </w:p>
     <w:p>
       <w:pPr>
-        <w:jc w:val="center"/>
+        <w:spacing w:after="20"/>
       </w:pPr>
       <w:r>
         <w:rPr>
           <w:b w:val="0"/>
-          <w:color w:val="646464"/>
-          <w:sz w:val="24"/>
+          <w:sz w:val="20"/>
         </w:rPr>
-        <w:t>MATRIX DER DURCHFAHRTSGENEHMIGUNG</w:t>
+        <w:t>rilascia al Signor/a:</w:t>
       </w:r>
     </w:p>
     <w:p>
       <w:pPr>
-        <w:jc w:val="center"/>
+        <w:spacing w:after="80"/>
+      </w:pPr>
+      <w:r>
+        <w:rPr>
+          <w:color w:val="464646"/>
+          <w:sz w:val="16"/>
+        </w:rPr>
+        <w:t>gewährt Herrn/Frau:  /  grants to Mr./Ms.:</w:t>
+      </w:r>
+    </w:p>
+    <w:p>
+      <w:pPr>
+        <w:spacing w:after="40"/>
+      </w:pPr>
+      <w:r>
+        <w:rPr>
+          <w:color w:val="6E6E6E"/>
+          <w:sz w:val="16"/>
+        </w:rPr>
+        <w:t xml:space="preserve">Nome / Vorname / First name:  </w:t>
+      </w:r>
+      <w:r>
+        <w:rPr>
+          <w:b/>
+          <w:sz w:val="22"/>
+        </w:rPr>
+        <w:t>{{ nome }}</w:t>
+      </w:r>
+    </w:p>
+    <w:p>
+      <w:pPr>
+        <w:spacing w:after="40"/>
+      </w:pPr>
+      <w:r>
+        <w:rPr>
+          <w:color w:val="6E6E6E"/>
+          <w:sz w:val="16"/>
+        </w:rPr>
+        <w:t xml:space="preserve">Cognome / Nachname / Last name:  </w:t>
+      </w:r>
+      <w:r>
+        <w:rPr>
+          <w:b/>
+          <w:sz w:val="22"/>
+        </w:rPr>
+        <w:t>{{ cognome }}</w:t>
+      </w:r>
+    </w:p>
+    <w:p>
+      <w:pPr>
+        <w:spacing w:after="60"/>
+      </w:pPr>
+      <w:r>
+        <w:rPr>
+          <w:color w:val="6E6E6E"/>
+          <w:sz w:val="16"/>
+        </w:rPr>
+        <w:t xml:space="preserve">Residente a / Wohnhaft in / Resident in:  </w:t>
+      </w:r>
+      <w:r>
+        <w:rPr>
+          <w:b/>
+          <w:sz w:val="22"/>
+        </w:rPr>
+        <w:t>{{ residenza }}</w:t>
+      </w:r>
+    </w:p>
+    <w:p>
+      <w:pPr>
+        <w:spacing w:after="20"/>
       </w:pPr>
       <w:r>
         <w:rPr>
           <w:b w:val="0"/>
-          <w:color w:val="828282"/>
-          <w:sz w:val="24"/>
+          <w:sz w:val="20"/>
         </w:rPr>
-        <w:t>TRANSIT AUTHORIZATION MATRIX</w:t>
+        <w:t>il quale ha dichiarato di dover percorrere la strada forestale sopra citata con il veicolo:</w:t>
+      </w:r>
+    </w:p>
+    <w:p>
+      <w:pPr>
+        <w:spacing w:after="60"/>
+      </w:pPr>
+      <w:r>
+        <w:rPr>
+          <w:color w:val="464646"/>
+          <w:sz w:val="16"/>
+        </w:rPr>
+        <w:t>der/die erklärt hat, die oben genannte Forststraße mit folgendem Fahrzeug befahren zu müssen:  /  who has declared the need to travel on the aforementioned forest road with the vehicle:</w:t>
+      </w:r>
+    </w:p>
+    <w:p>
+      <w:pPr>
+        <w:spacing w:after="40"/>
+      </w:pPr>
+      <w:r>
+        <w:rPr>
+          <w:color w:val="6E6E6E"/>
+          <w:sz w:val="16"/>
+        </w:rPr>
+        <w:t xml:space="preserve">Tipo veicolo / Fahrzeugtyp / Vehicle type:  </w:t>
+      </w:r>
+      <w:r>
+        <w:rPr>
+          <w:b/>
+          <w:sz w:val="22"/>
+        </w:rPr>
+        <w:t>{{ tipo_veicolo }}</w:t>
+      </w:r>
+    </w:p>
+    <w:p>
+      <w:pPr>
+        <w:spacing w:after="80"/>
+      </w:pPr>
+      <w:r>
+        <w:rPr>
+          <w:color w:val="6E6E6E"/>
+          <w:sz w:val="16"/>
+        </w:rPr>
+        <w:t xml:space="preserve">Targa / Kennzeichen / Plate:  </w:t>
+      </w:r>
+      <w:r>
+        <w:rPr>
+          <w:b/>
+          <w:sz w:val="22"/>
+        </w:rPr>
+        <w:t>{{ targa }}</w:t>
       </w:r>
     </w:p>
     <w:p>
@@ -72,382 +255,122 @@
       <w:r>
         <w:rPr>
           <w:b/>
-          <w:sz w:val="24"/>
-        </w:rPr>
-        <w:t>SU STRADA FORESTALE DI TIPO B</w:t>
-      </w:r>
-    </w:p>
-    <w:p>
-      <w:pPr>
-        <w:jc w:val="center"/>
-      </w:pPr>
-      <w:r>
-        <w:rPr>
-          <w:b w:val="0"/>
-          <w:color w:val="646464"/>
           <w:sz w:val="22"/>
-        </w:rPr>
-        <w:t>AUF FORSTSTRASSE TYP B</w:t>
-      </w:r>
-    </w:p>
-    <w:p>
-      <w:pPr>
-        <w:jc w:val="center"/>
-      </w:pPr>
-      <w:r>
-        <w:rPr>
-          <w:b w:val="0"/>
-          <w:color w:val="828282"/>
-          <w:sz w:val="22"/>
-        </w:rPr>
-        <w:t>ON FOREST ROAD TYPE B</w:t>
-      </w:r>
-    </w:p>
-    <w:p>
-      <w:r>
-        <w:rPr>
-          <w:sz w:val="16"/>
-        </w:rPr>
-        <w:t>────────────────────────────────────────────────────────────</w:t>
-      </w:r>
-    </w:p>
-    <w:p/>
-    <w:p>
-      <w:pPr>
-        <w:jc w:val="left"/>
-      </w:pPr>
-      <w:r>
-        <w:rPr>
-          <w:b/>
-          <w:sz w:val="22"/>
-        </w:rPr>
-        <w:t>Il proprietario/gestore della Strada Forestale di Tipo B denominata</w:t>
-      </w:r>
-    </w:p>
-    <w:p>
-      <w:pPr>
-        <w:jc w:val="left"/>
-      </w:pPr>
-      <w:r>
-        <w:rPr>
-          <w:b w:val="0"/>
-          <w:color w:val="646464"/>
-          <w:sz w:val="20"/>
-        </w:rPr>
-        <w:t>Der Eigentümer/Verwalter der Forststraße Typ B namens</w:t>
-      </w:r>
-    </w:p>
-    <w:p>
-      <w:pPr>
-        <w:jc w:val="left"/>
-      </w:pPr>
-      <w:r>
-        <w:rPr>
-          <w:b w:val="0"/>
-          <w:color w:val="828282"/>
-          <w:sz w:val="20"/>
-        </w:rPr>
-        <w:t>The owner/manager of the Type B Forest Road named</w:t>
-      </w:r>
-    </w:p>
-    <w:p>
-      <w:pPr>
-        <w:jc w:val="center"/>
-      </w:pPr>
-      <w:r>
-        <w:rPr>
-          <w:b/>
-          <w:sz w:val="28"/>
-        </w:rPr>
-        <w:t>MALGA CAMPO</w:t>
-      </w:r>
-    </w:p>
-    <w:p>
-      <w:pPr>
-        <w:jc w:val="left"/>
-      </w:pPr>
-      <w:r>
-        <w:rPr>
-          <w:b/>
-          <w:sz w:val="22"/>
-        </w:rPr>
-        <w:t>rilascia al Signor/a:</w:t>
-      </w:r>
-    </w:p>
-    <w:p>
-      <w:pPr>
-        <w:jc w:val="left"/>
-      </w:pPr>
-      <w:r>
-        <w:rPr>
-          <w:b w:val="0"/>
-          <w:color w:val="646464"/>
-          <w:sz w:val="20"/>
-        </w:rPr>
-        <w:t>gewährt Herrn/Frau:</w:t>
-      </w:r>
-    </w:p>
-    <w:p>
-      <w:pPr>
-        <w:jc w:val="left"/>
-      </w:pPr>
-      <w:r>
-        <w:rPr>
-          <w:b w:val="0"/>
-          <w:color w:val="828282"/>
-          <w:sz w:val="20"/>
-        </w:rPr>
-        <w:t>grants to Mr./Ms.:</w:t>
-      </w:r>
-    </w:p>
-    <w:p/>
-    <w:p>
-      <w:r>
-        <w:rPr>
-          <w:color w:val="505050"/>
-          <w:sz w:val="20"/>
-        </w:rPr>
-        <w:t xml:space="preserve">Nome / Vorname / First name:  </w:t>
-      </w:r>
-      <w:r>
-        <w:rPr>
-          <w:b/>
-          <w:sz w:val="24"/>
-        </w:rPr>
-        <w:t>{{ nome }}</w:t>
-      </w:r>
-    </w:p>
-    <w:p>
-      <w:r>
-        <w:rPr>
-          <w:color w:val="505050"/>
-          <w:sz w:val="20"/>
-        </w:rPr>
-        <w:t xml:space="preserve">Cognome / Nachname / Last name:  </w:t>
-      </w:r>
-      <w:r>
-        <w:rPr>
-          <w:b/>
-          <w:sz w:val="24"/>
-        </w:rPr>
-        <w:t>{{ cognome }}</w:t>
-      </w:r>
-    </w:p>
-    <w:p>
-      <w:r>
-        <w:rPr>
-          <w:color w:val="505050"/>
-          <w:sz w:val="20"/>
-        </w:rPr>
-        <w:t xml:space="preserve">Residente a / Wohnhaft in / Resident in:  </w:t>
-      </w:r>
-      <w:r>
-        <w:rPr>
-          <w:b/>
-          <w:sz w:val="24"/>
-        </w:rPr>
-        <w:t>{{ residenza }}</w:t>
-      </w:r>
-    </w:p>
-    <w:p/>
-    <w:p>
-      <w:pPr>
-        <w:jc w:val="left"/>
-      </w:pPr>
-      <w:r>
-        <w:rPr>
-          <w:b/>
-          <w:sz w:val="22"/>
-        </w:rPr>
-        <w:t>il quale ha dichiarato di dover percorrere la strada forestale sopra citata</w:t>
-        <w:br/>
-        <w:t>con il veicolo:</w:t>
-      </w:r>
-    </w:p>
-    <w:p>
-      <w:pPr>
-        <w:jc w:val="left"/>
-      </w:pPr>
-      <w:r>
-        <w:rPr>
-          <w:b w:val="0"/>
-          <w:color w:val="646464"/>
-          <w:sz w:val="20"/>
-        </w:rPr>
-        <w:t>der/die erklärt hat, die oben genannte Forststraße</w:t>
-        <w:br/>
-        <w:t>mit folgendem Fahrzeug befahren zu müssen:</w:t>
-      </w:r>
-    </w:p>
-    <w:p>
-      <w:pPr>
-        <w:jc w:val="left"/>
-      </w:pPr>
-      <w:r>
-        <w:rPr>
-          <w:b w:val="0"/>
-          <w:color w:val="828282"/>
-          <w:sz w:val="20"/>
-        </w:rPr>
-        <w:t>who has declared the need to travel on the aforementioned forest road</w:t>
-        <w:br/>
-        <w:t>with the following vehicle:</w:t>
-      </w:r>
-    </w:p>
-    <w:p/>
-    <w:p>
-      <w:r>
-        <w:rPr>
-          <w:color w:val="505050"/>
-          <w:sz w:val="20"/>
-        </w:rPr>
-        <w:t xml:space="preserve">Tipo veicolo / Fahrzeugtyp / Vehicle type:  </w:t>
-      </w:r>
-      <w:r>
-        <w:rPr>
-          <w:b/>
-          <w:sz w:val="24"/>
-        </w:rPr>
-        <w:t>{{ tipo_veicolo }}</w:t>
-      </w:r>
-    </w:p>
-    <w:p>
-      <w:r>
-        <w:rPr>
-          <w:color w:val="505050"/>
-          <w:sz w:val="20"/>
-        </w:rPr>
-        <w:t xml:space="preserve">Targa / Kennzeichen / Plate:  </w:t>
-      </w:r>
-      <w:r>
-        <w:rPr>
-          <w:b/>
-          <w:sz w:val="24"/>
-        </w:rPr>
-        <w:t>{{ targa }}</w:t>
-      </w:r>
-    </w:p>
-    <w:p/>
-    <w:p>
-      <w:pPr>
-        <w:jc w:val="center"/>
-      </w:pPr>
-      <w:r>
-        <w:rPr>
-          <w:b/>
-          <w:sz w:val="24"/>
         </w:rPr>
         <w:t>L'AUTORIZZAZIONE AL TRANSITO PER IL PERIODO</w:t>
       </w:r>
     </w:p>
     <w:p>
       <w:pPr>
+        <w:spacing w:after="20"/>
         <w:jc w:val="center"/>
       </w:pPr>
       <w:r>
         <w:rPr>
-          <w:b w:val="0"/>
-          <w:color w:val="646464"/>
-          <w:sz w:val="22"/>
+          <w:color w:val="464646"/>
+          <w:sz w:val="16"/>
         </w:rPr>
-        <w:t>DIE DURCHFAHRTSGENEHMIGUNG FÜR DEN ZEITRAUM</w:t>
+        <w:t>DIE DURCHFAHRTSGENEHMIGUNG FÜR DEN ZEITRAUM  /  THE TRANSIT AUTHORIZATION FOR THE PERIOD</w:t>
       </w:r>
     </w:p>
     <w:p>
       <w:pPr>
-        <w:jc w:val="center"/>
+        <w:spacing w:after="60"/>
       </w:pPr>
       <w:r>
         <w:rPr>
-          <w:b w:val="0"/>
-          <w:color w:val="828282"/>
-          <w:sz w:val="22"/>
+          <w:color w:val="6E6E6E"/>
+          <w:sz w:val="16"/>
         </w:rPr>
-        <w:t>THE TRANSIT AUTHORIZATION FOR THE PERIOD</w:t>
-      </w:r>
-    </w:p>
-    <w:p>
-      <w:r>
-        <w:rPr>
-          <w:color w:val="505050"/>
-          <w:sz w:val="20"/>
-        </w:rPr>
-        <w:t xml:space="preserve">dal / von / from  </w:t>
+        <w:t xml:space="preserve">dal/von/from  </w:t>
       </w:r>
       <w:r>
         <w:rPr>
           <w:b/>
-          <w:sz w:val="24"/>
+          <w:sz w:val="22"/>
         </w:rPr>
         <w:t>{{ dal }}</w:t>
       </w:r>
       <w:r>
-        <w:t xml:space="preserve">      </w:t>
+        <w:t xml:space="preserve">        </w:t>
       </w:r>
       <w:r>
         <w:rPr>
-          <w:color w:val="505050"/>
-          <w:sz w:val="20"/>
+          <w:color w:val="6E6E6E"/>
+          <w:sz w:val="16"/>
         </w:rPr>
-        <w:t xml:space="preserve">al / bis / to  </w:t>
+        <w:t xml:space="preserve">al/bis/to  </w:t>
       </w:r>
       <w:r>
         <w:rPr>
           <w:b/>
-          <w:sz w:val="24"/>
+          <w:sz w:val="22"/>
         </w:rPr>
         <w:t>{{ al }}</w:t>
       </w:r>
     </w:p>
-    <w:p/>
     <w:p>
+      <w:pPr>
+        <w:spacing w:after="20"/>
+      </w:pPr>
       <w:r>
         <w:rPr>
-          <w:sz w:val="16"/>
+          <w:sz w:val="14"/>
         </w:rPr>
-        <w:t>────────────────────────────────────────────────────────────</w:t>
+        <w:t>──────────────────────────────────────────────────────────────</w:t>
       </w:r>
     </w:p>
     <w:p>
       <w:pPr>
+        <w:spacing w:after="20"/>
         <w:jc w:val="center"/>
       </w:pPr>
       <w:r>
         <w:rPr>
           <w:b/>
-          <w:sz w:val="36"/>
+          <w:sz w:val="32"/>
         </w:rPr>
         <w:t>N.  {{ numero }} / {{ anno }}</w:t>
       </w:r>
     </w:p>
     <w:p>
+      <w:pPr>
+        <w:spacing w:after="20"/>
+      </w:pPr>
       <w:r>
         <w:rPr>
-          <w:sz w:val="16"/>
+          <w:sz w:val="14"/>
         </w:rPr>
-        <w:t>────────────────────────────────────────────────────────────</w:t>
+        <w:t>──────────────────────────────────────────────────────────────</w:t>
       </w:r>
     </w:p>
-    <w:p/>
     <w:p>
+      <w:pPr>
+        <w:spacing w:after="40"/>
+      </w:pPr>
+    </w:p>
+    <w:p>
+      <w:pPr>
+        <w:spacing w:after="40"/>
+      </w:pPr>
       <w:r>
         <w:rPr>
-          <w:color w:val="505050"/>
-          <w:sz w:val="20"/>
+          <w:color w:val="6E6E6E"/>
+          <w:sz w:val="16"/>
         </w:rPr>
         <w:t xml:space="preserve">Data emissione / Ausstellungsdatum / Issue date:  </w:t>
       </w:r>
       <w:r>
         <w:rPr>
           <w:b/>
-          <w:sz w:val="24"/>
+          <w:sz w:val="22"/>
         </w:rPr>
         <w:t>{{ data_emissione }}</w:t>
       </w:r>
     </w:p>
     <w:sectPr>
       <w:pgSz w:w="11906" w:h="16838"/>
-      <w:pgMar w:top="1020" w:right="1417" w:bottom="1020" w:left="1417" w:header="720" w:footer="720" w:gutter="0"/>
+      <w:pgMar w:top="850" w:right="1417" w:bottom="850" w:left="1417" w:header="720" w:footer="720" w:gutter="0"/>
       <w:cols w:space="720"/>
       <w:docGrid w:linePitch="360"/>
     </w:sectPr>
@@ -819,11 +742,11 @@
     <w:qFormat/>
     <w:rsid w:val="00FC693F"/>
     <w:pPr>
-      <w:spacing w:before="0" w:after="60"/>
+      <w:spacing w:before="0" w:after="40"/>
     </w:pPr>
     <w:rPr>
       <w:rFonts w:ascii="Arial" w:hAnsi="Arial"/>
-      <w:sz w:val="22"/>
+      <w:sz w:val="20"/>
     </w:rPr>
   </w:style>
   <w:style w:type="paragraph" w:styleId="Header">

</xml_diff>